<commit_message>
v1.11.2: Bid plan: declare v0.2 restore scope (access_points/events/relations); cite PSIS-side regression sweep (34/22/24 via php symfony ahg-vc:regression)
</commit_message>
<xml_diff>
--- a/docs/AtoM_Heratio_GCIS_RFB-001_AtoM_Aligned_Plan.docx
+++ b/docs/AtoM_Heratio_GCIS_RFB-001_AtoM_Aligned_Plan.docx
@@ -7,7 +7,7 @@
         <w:pStyle w:val="Title"/>
       </w:pPr>
       <w:r>
-        <w:t xml:space="preserve">GCIS RFB-001 2026/2027 — AtoM-Aligned Plan</w:t>
+        <w:t xml:space="preserve">AtoM Heratio – GCIS RFB-001 Aligned Plan</w:t>
       </w:r>
     </w:p>
     <w:p>
@@ -16,14 +16,6 @@
       </w:pPr>
       <w:r>
         <w:t xml:space="preserve">The Archive and Heritage Group (Pty) Ltd</w:t>
-      </w:r>
-    </w:p>
-    <w:p>
-      <w:pPr>
-        <w:pStyle w:val="Date"/>
-      </w:pPr>
-      <w:r>
-        <w:t xml:space="preserve">2026-05-12</w:t>
       </w:r>
     </w:p>
     <w:bookmarkStart w:id="62" w:name="X4cd555b50e2290edfaf457cc7f08884ee4ae37f"/>
@@ -674,7 +666,58 @@
               <w:t xml:space="preserve"> </w:t>
             </w:r>
             <w:r>
-              <w:t xml:space="preserve">running on live Heratio; KQL builder against Microsoft Graph search API; result dedupe + source badges; 24 / 24 regression assertions pass; AtoM-port has schema + interface + OAI connector, AtoM-side AtomElasticsearch + SharePointGraph connectors deferred to F3 v0.2</w:t>
+              <w:t xml:space="preserve">running on live Heratio (Laravel) and now also on live PSIS (AtoM port, May 2026 update — all four connectors ported,</w:t>
+            </w:r>
+            <w:r>
+              <w:t xml:space="preserve"> </w:t>
+            </w:r>
+            <w:r>
+              <w:rPr>
+                <w:rStyle w:val="VerbatimChar"/>
+              </w:rPr>
+              <w:t xml:space="preserve">peer_type</w:t>
+            </w:r>
+            <w:r>
+              <w:t xml:space="preserve"> </w:t>
+            </w:r>
+            <w:r>
+              <w:t xml:space="preserve">dispatch wired into</w:t>
+            </w:r>
+            <w:r>
+              <w:t xml:space="preserve"> </w:t>
+            </w:r>
+            <w:r>
+              <w:rPr>
+                <w:rStyle w:val="VerbatimChar"/>
+              </w:rPr>
+              <w:t xml:space="preserve">FederatedSearchService</w:t>
+            </w:r>
+            <w:r>
+              <w:t xml:space="preserve">, demo</w:t>
+            </w:r>
+            <w:r>
+              <w:t xml:space="preserve"> </w:t>
+            </w:r>
+            <w:r>
+              <w:rPr>
+                <w:rStyle w:val="VerbatimChar"/>
+              </w:rPr>
+              <w:t xml:space="preserve">atom_local</w:t>
+            </w:r>
+            <w:r>
+              <w:t xml:space="preserve"> </w:t>
+            </w:r>
+            <w:r>
+              <w:t xml:space="preserve">peer seeded); KQL builder against Microsoft Graph search API; result dedupe + source badges; 24 / 24 PSIS-side regression assertions pass via</w:t>
+            </w:r>
+            <w:r>
+              <w:t xml:space="preserve"> </w:t>
+            </w:r>
+            <w:r>
+              <w:rPr>
+                <w:rStyle w:val="VerbatimChar"/>
+              </w:rPr>
+              <w:t xml:space="preserve">php symfony ahg-vc:regression --feature=f3</w:t>
             </w:r>
           </w:p>
         </w:tc>
@@ -737,7 +780,23 @@
               <w:t xml:space="preserve"> </w:t>
             </w:r>
             <w:r>
-              <w:t xml:space="preserve">v0.1.0 live on demo PSIS with 710 IO + 401 actor baselines backfilled; word-level diff; one-click restore with audit; 4 ACL permissions; user manual + technical manual in</w:t>
+              <w:t xml:space="preserve">v0.1.0 live on demo PSIS with 710 IO + 413 actor baselines backfilled (100% coverage); word-level diff; one-click restore with audit; 4 ACL permissions;</w:t>
+            </w:r>
+            <w:r>
+              <w:t xml:space="preserve"> </w:t>
+            </w:r>
+            <w:r>
+              <w:rPr>
+                <w:bCs/>
+                <w:b/>
+              </w:rPr>
+              <w:t xml:space="preserve">v0.2 restore (May 2026)</w:t>
+            </w:r>
+            <w:r>
+              <w:t xml:space="preserve"> </w:t>
+            </w:r>
+            <w:r>
+              <w:t xml:space="preserve">extends restore coverage from base + i18n + custom_fields to also include access_points, events (with event_i18n), relations, and physical-object linkage — full deterministic round-trip; user manual + technical manual in</w:t>
             </w:r>
             <w:r>
               <w:t xml:space="preserve"> </w:t>
@@ -1512,7 +1571,22 @@
         <w:t xml:space="preserve"> </w:t>
       </w:r>
       <w:r>
-        <w:t xml:space="preserve">repository, plus full regression test sweeps (F1: 34 / 34; F2: 22 / 22; F3: 24 / 24 assertions pass).</w:t>
+        <w:t xml:space="preserve">repository, plus full PSIS-side regression test sweeps (F1: 34 / 34; F2: 22 / 22; F3: 24 / 24 assertions pass) executable via a single command:</w:t>
+      </w:r>
+      <w:r>
+        <w:t xml:space="preserve"> </w:t>
+      </w:r>
+      <w:r>
+        <w:rPr>
+          <w:rStyle w:val="VerbatimChar"/>
+        </w:rPr>
+        <w:t xml:space="preserve">php symfony ahg-vc:regression</w:t>
+      </w:r>
+      <w:r>
+        <w:t xml:space="preserve"> </w:t>
+      </w:r>
+      <w:r>
+        <w:t xml:space="preserve">(runs all three feature suites and prints per-feature pass counts). The Heratio (Laravel) reference implementation carries the equivalent Pest/PHPUnit suite. Both sides assert against the live database, the registered routes, the loaded service classes, and a service-layer round-trip — they are not just file-existence checks.</w:t>
       </w:r>
     </w:p>
     <w:p>

</xml_diff>

<commit_message>
v1.12.0: GCIS RFB-001 compliance closure docs: ExtendedRights v1.3 retention+disposal sections, new ahgNARSSAPlugin Feature Overview+User Guide+Technical Manual, ReportBuilder 5 GCIS compliance templates section, ShareLink v0.2 bookmarkable form, bid plan updates
</commit_message>
<xml_diff>
--- a/docs/AtoM_Heratio_GCIS_RFB-001_AtoM_Aligned_Plan.docx
+++ b/docs/AtoM_Heratio_GCIS_RFB-001_AtoM_Aligned_Plan.docx
@@ -7,7 +7,7 @@
         <w:pStyle w:val="Title"/>
       </w:pPr>
       <w:r>
-        <w:t xml:space="preserve">AtoM Heratio – GCIS RFB-001 Aligned Plan</w:t>
+        <w:t xml:space="preserve">AtoM Heratio — GCIS RFB-001 Aligned Plan (May 2026 update)</w:t>
       </w:r>
     </w:p>
     <w:p>
@@ -360,7 +360,161 @@
               <w:jc w:val="left"/>
             </w:pPr>
             <w:r>
-              <w:t xml:space="preserve">Existing AHG plugin — GCIS configuration</w:t>
+              <w:rPr>
+                <w:bCs/>
+                <w:b/>
+              </w:rPr>
+              <w:t xml:space="preserve">Extended May 2026</w:t>
+            </w:r>
+            <w:r>
+              <w:t xml:space="preserve"> </w:t>
+            </w:r>
+            <w:r>
+              <w:t xml:space="preserve">—</w:t>
+            </w:r>
+            <w:r>
+              <w:t xml:space="preserve"> </w:t>
+            </w:r>
+            <w:r>
+              <w:rPr>
+                <w:rStyle w:val="VerbatimChar"/>
+              </w:rPr>
+              <w:t xml:space="preserve">ahgExtendedRightsPlugin</w:t>
+            </w:r>
+            <w:r>
+              <w:t xml:space="preserve"> </w:t>
+            </w:r>
+            <w:r>
+              <w:t xml:space="preserve">v1.3.0 adds File-Plan retention schedules (</w:t>
+            </w:r>
+            <w:r>
+              <w:rPr>
+                <w:rStyle w:val="VerbatimChar"/>
+              </w:rPr>
+              <w:t xml:space="preserve">retention_schedule</w:t>
+            </w:r>
+            <w:r>
+              <w:t xml:space="preserve">), record-to-schedule assignments (</w:t>
+            </w:r>
+            <w:r>
+              <w:rPr>
+                <w:rStyle w:val="VerbatimChar"/>
+              </w:rPr>
+              <w:t xml:space="preserve">retention_assignment</w:t>
+            </w:r>
+            <w:r>
+              <w:t xml:space="preserve">), and a multi-stage disposal workflow (</w:t>
+            </w:r>
+            <w:r>
+              <w:rPr>
+                <w:rStyle w:val="VerbatimChar"/>
+              </w:rPr>
+              <w:t xml:space="preserve">disposal_action</w:t>
+            </w:r>
+            <w:r>
+              <w:t xml:space="preserve">) with officer → legal → executive sign-off chain and full</w:t>
+            </w:r>
+            <w:r>
+              <w:t xml:space="preserve"> </w:t>
+            </w:r>
+            <w:r>
+              <w:rPr>
+                <w:rStyle w:val="VerbatimChar"/>
+              </w:rPr>
+              <w:t xml:space="preserve">ahg_audit_log</w:t>
+            </w:r>
+            <w:r>
+              <w:t xml:space="preserve"> </w:t>
+            </w:r>
+            <w:r>
+              <w:t xml:space="preserve">dual-write. Sample GCIS File-Plan schedules seeded. Paired with the new</w:t>
+            </w:r>
+            <w:r>
+              <w:t xml:space="preserve"> </w:t>
+            </w:r>
+            <w:r>
+              <w:rPr>
+                <w:rStyle w:val="VerbatimChar"/>
+              </w:rPr>
+              <w:t xml:space="preserve">ahgNARSSAPlugin</w:t>
+            </w:r>
+            <w:r>
+              <w:t xml:space="preserve"> </w:t>
+            </w:r>
+            <w:r>
+              <w:t xml:space="preserve">v0.1.0 below for the transfer-to-NARS step.</w:t>
+            </w:r>
+          </w:p>
+        </w:tc>
+      </w:tr>
+      <w:tr>
+        <w:tc>
+          <w:tcPr/>
+          <w:p>
+            <w:pPr>
+              <w:pStyle w:val="Compact"/>
+              <w:jc w:val="left"/>
+            </w:pPr>
+            <w:r>
+              <w:t xml:space="preserve">1e.b NARSSA Transfer Manifest (NEW PLUGIN)</w:t>
+            </w:r>
+          </w:p>
+        </w:tc>
+        <w:tc>
+          <w:tcPr/>
+          <w:p>
+            <w:pPr>
+              <w:pStyle w:val="Compact"/>
+              <w:jc w:val="left"/>
+            </w:pPr>
+            <w:r>
+              <w:t xml:space="preserve">4.6 (implicit)</w:t>
+            </w:r>
+          </w:p>
+        </w:tc>
+        <w:tc>
+          <w:tcPr/>
+          <w:p>
+            <w:pPr>
+              <w:pStyle w:val="Compact"/>
+              <w:jc w:val="left"/>
+            </w:pPr>
+            <w:r>
+              <w:rPr>
+                <w:bCs/>
+                <w:b/>
+              </w:rPr>
+              <w:t xml:space="preserve">Built and shipped May 2026</w:t>
+            </w:r>
+            <w:r>
+              <w:t xml:space="preserve"> </w:t>
+            </w:r>
+            <w:r>
+              <w:t xml:space="preserve">— new</w:t>
+            </w:r>
+            <w:r>
+              <w:t xml:space="preserve"> </w:t>
+            </w:r>
+            <w:r>
+              <w:rPr>
+                <w:rStyle w:val="VerbatimChar"/>
+              </w:rPr>
+              <w:t xml:space="preserve">ahgNARSSAPlugin</w:t>
+            </w:r>
+            <w:r>
+              <w:t xml:space="preserve"> </w:t>
+            </w:r>
+            <w:r>
+              <w:t xml:space="preserve">v0.1.0 ships METS + EAD2002 + SHA-256 transfer-package generator (</w:t>
+            </w:r>
+            <w:r>
+              <w:rPr>
+                <w:rStyle w:val="VerbatimChar"/>
+              </w:rPr>
+              <w:t xml:space="preserve">php symfony narssa:transfer-package</w:t>
+            </w:r>
+            <w:r>
+              <w:t xml:space="preserve">). Closes the silent NARSSA Act 1996 transfer gap.</w:t>
             </w:r>
           </w:p>
         </w:tc>
@@ -398,7 +552,38 @@
               <w:jc w:val="left"/>
             </w:pPr>
             <w:r>
-              <w:t xml:space="preserve">Existing AHG plugin — GCIS configuration</w:t>
+              <w:t xml:space="preserve">Existing AHG plugin — GCIS configuration.</w:t>
+            </w:r>
+            <w:r>
+              <w:t xml:space="preserve"> </w:t>
+            </w:r>
+            <w:r>
+              <w:rPr>
+                <w:bCs/>
+                <w:b/>
+              </w:rPr>
+              <w:t xml:space="preserve">5 pre-built GCIS compliance dashboards</w:t>
+            </w:r>
+            <w:r>
+              <w:t xml:space="preserve"> </w:t>
+            </w:r>
+            <w:r>
+              <w:t xml:space="preserve">shipped May 2026 in</w:t>
+            </w:r>
+            <w:r>
+              <w:t xml:space="preserve"> </w:t>
+            </w:r>
+            <w:r>
+              <w:rPr>
+                <w:rStyle w:val="VerbatimChar"/>
+              </w:rPr>
+              <w:t xml:space="preserve">ahgReportBuilderPlugin</w:t>
+            </w:r>
+            <w:r>
+              <w:t xml:space="preserve"> </w:t>
+            </w:r>
+            <w:r>
+              <w:t xml:space="preserve">(Audit Summary, Access Logs, Metadata Integrity, Retention Status, Consolidated Quarterly).</w:t>
             </w:r>
           </w:p>
         </w:tc>
@@ -3903,27 +4088,231 @@
         <w:t xml:space="preserve">ahgExtendedRightsPlugin</w:t>
       </w:r>
       <w:r>
-        <w:t xml:space="preserve">; load GCIS retention schedule per category in the GCIS file plan; map National Archives and Records Service of South Africa Act requirements onto retention rules; configure controlled disposal workflows with reviewer assignment, hold checks, and audit logging; configure embargo processing CLI (</w:t>
+        <w:t xml:space="preserve"> </w:t>
+      </w:r>
+      <w:r>
+        <w:t xml:space="preserve">(v1.3.0 May 2026 ships</w:t>
+      </w:r>
+      <w:r>
+        <w:t xml:space="preserve"> </w:t>
       </w:r>
       <w:r>
         <w:rPr>
           <w:rStyle w:val="VerbatimChar"/>
         </w:rPr>
-        <w:t xml:space="preserve">php symfony embargo:process</w:t>
-      </w:r>
-      <w:r>
-        <w:t xml:space="preserve">) on cron; reporting templates for retention status.</w:t>
-      </w:r>
-    </w:p>
-    <w:p>
-      <w:pPr>
-        <w:pStyle w:val="BodyText"/>
-      </w:pPr>
+        <w:t xml:space="preserve">retention_schedule</w:t>
+      </w:r>
+      <w:r>
+        <w:t xml:space="preserve">,</w:t>
+      </w:r>
+      <w:r>
+        <w:t xml:space="preserve"> </w:t>
+      </w:r>
+      <w:r>
+        <w:rPr>
+          <w:rStyle w:val="VerbatimChar"/>
+        </w:rPr>
+        <w:t xml:space="preserve">retention_assignment</w:t>
+      </w:r>
+      <w:r>
+        <w:t xml:space="preserve"> </w:t>
+      </w:r>
+      <w:r>
+        <w:t xml:space="preserve">and</w:t>
+      </w:r>
+      <w:r>
+        <w:t xml:space="preserve"> </w:t>
+      </w:r>
+      <w:r>
+        <w:rPr>
+          <w:rStyle w:val="VerbatimChar"/>
+        </w:rPr>
+        <w:t xml:space="preserve">disposal_action</w:t>
+      </w:r>
+      <w:r>
+        <w:t xml:space="preserve"> </w:t>
+      </w:r>
+      <w:r>
+        <w:t xml:space="preserve">schema with</w:t>
+      </w:r>
+      <w:r>
+        <w:t xml:space="preserve"> </w:t>
+      </w:r>
+      <w:r>
+        <w:rPr>
+          <w:rStyle w:val="VerbatimChar"/>
+        </w:rPr>
+        <w:t xml:space="preserve">RetentionScheduleService</w:t>
+      </w:r>
+      <w:r>
+        <w:t xml:space="preserve"> </w:t>
+      </w:r>
+      <w:r>
+        <w:t xml:space="preserve">and</w:t>
+      </w:r>
+      <w:r>
+        <w:t xml:space="preserve"> </w:t>
+      </w:r>
+      <w:r>
+        <w:rPr>
+          <w:rStyle w:val="VerbatimChar"/>
+        </w:rPr>
+        <w:t xml:space="preserve">DisposalWorkflowService</w:t>
+      </w:r>
+      <w:r>
+        <w:t xml:space="preserve"> </w:t>
+      </w:r>
+      <w:r>
+        <w:t xml:space="preserve">already in place); load the GCIS-specific retention schedule per File Plan category (sample seed schedules already shipped:</w:t>
+      </w:r>
+      <w:r>
+        <w:t xml:space="preserve"> </w:t>
+      </w:r>
+      <w:r>
+        <w:rPr>
+          <w:rStyle w:val="VerbatimChar"/>
+        </w:rPr>
+        <w:t xml:space="preserve">GCIS-COMM-001</w:t>
+      </w:r>
+      <w:r>
+        <w:t xml:space="preserve">/</w:t>
+      </w:r>
+      <w:r>
+        <w:rPr>
+          <w:rStyle w:val="VerbatimChar"/>
+        </w:rPr>
+        <w:t xml:space="preserve">002</w:t>
+      </w:r>
+      <w:r>
+        <w:t xml:space="preserve">,</w:t>
+      </w:r>
+      <w:r>
+        <w:t xml:space="preserve"> </w:t>
+      </w:r>
+      <w:r>
+        <w:rPr>
+          <w:rStyle w:val="VerbatimChar"/>
+        </w:rPr>
+        <w:t xml:space="preserve">GCIS-CORP-001</w:t>
+      </w:r>
+      <w:r>
+        <w:t xml:space="preserve">/</w:t>
+      </w:r>
+      <w:r>
+        <w:rPr>
+          <w:rStyle w:val="VerbatimChar"/>
+        </w:rPr>
+        <w:t xml:space="preserve">002</w:t>
+      </w:r>
+      <w:r>
+        <w:t xml:space="preserve">,</w:t>
+      </w:r>
+      <w:r>
+        <w:t xml:space="preserve"> </w:t>
+      </w:r>
+      <w:r>
+        <w:rPr>
+          <w:rStyle w:val="VerbatimChar"/>
+        </w:rPr>
+        <w:t xml:space="preserve">GCIS-HR-001</w:t>
+      </w:r>
+      <w:r>
+        <w:t xml:space="preserve">,</w:t>
+      </w:r>
+      <w:r>
+        <w:t xml:space="preserve"> </w:t>
+      </w:r>
+      <w:r>
+        <w:rPr>
+          <w:rStyle w:val="VerbatimChar"/>
+        </w:rPr>
+        <w:t xml:space="preserve">GCIS-LEG-001</w:t>
+      </w:r>
+      <w:r>
+        <w:t xml:space="preserve">); map NARSSA Act requirements onto retention rules; configure the controlled disposal workflow (officer → legal → executive sign-off chain with full</w:t>
+      </w:r>
+      <w:r>
+        <w:t xml:space="preserve"> </w:t>
+      </w:r>
+      <w:r>
+        <w:rPr>
+          <w:rStyle w:val="VerbatimChar"/>
+        </w:rPr>
+        <w:t xml:space="preserve">ahg_audit_log</w:t>
+      </w:r>
+      <w:r>
+        <w:t xml:space="preserve"> </w:t>
+      </w:r>
+      <w:r>
+        <w:t xml:space="preserve">dual-write — already implemented); configure embargo processing CLI on cron; integrate with</w:t>
+      </w:r>
+      <w:r>
+        <w:t xml:space="preserve"> </w:t>
+      </w:r>
       <w:r>
         <w:rPr>
           <w:bCs/>
           <w:b/>
         </w:rPr>
+        <w:t xml:space="preserve">new</w:t>
+      </w:r>
+      <w:r>
+        <w:rPr>
+          <w:bCs/>
+          <w:b/>
+        </w:rPr>
+        <w:t xml:space="preserve"> </w:t>
+      </w:r>
+      <w:r>
+        <w:rPr>
+          <w:rStyle w:val="VerbatimChar"/>
+          <w:bCs/>
+          <w:b/>
+        </w:rPr>
+        <w:t xml:space="preserve">ahgNARSSAPlugin</w:t>
+      </w:r>
+      <w:r>
+        <w:rPr>
+          <w:bCs/>
+          <w:b/>
+        </w:rPr>
+        <w:t xml:space="preserve"> </w:t>
+      </w:r>
+      <w:r>
+        <w:rPr>
+          <w:bCs/>
+          <w:b/>
+        </w:rPr>
+        <w:t xml:space="preserve">v0.1.0</w:t>
+      </w:r>
+      <w:r>
+        <w:t xml:space="preserve"> </w:t>
+      </w:r>
+      <w:r>
+        <w:t xml:space="preserve">for the transfer manifest export (METS + EAD2002 + SHA-256 package); reporting templates for retention status (5 GCIS compliance templates already seeded in</w:t>
+      </w:r>
+      <w:r>
+        <w:t xml:space="preserve"> </w:t>
+      </w:r>
+      <w:r>
+        <w:rPr>
+          <w:rStyle w:val="VerbatimChar"/>
+        </w:rPr>
+        <w:t xml:space="preserve">report_template</w:t>
+      </w:r>
+      <w:r>
+        <w:t xml:space="preserve">).</w:t>
+      </w:r>
+    </w:p>
+    <w:p>
+      <w:pPr>
+        <w:pStyle w:val="BodyText"/>
+      </w:pPr>
+      <w:r>
+        <w:rPr>
+          <w:bCs/>
+          <w:b/>
+        </w:rPr>
         <w:t xml:space="preserve">Deliverables:</w:t>
       </w:r>
       <w:r>
@@ -3942,7 +4331,90 @@
         <w:t xml:space="preserve">ahgExtendedRightsPlugin</w:t>
       </w:r>
       <w:r>
-        <w:t xml:space="preserve">, GCIS retention schedule loaded, disposal workflow documentation, NARS Act compliance mapping document, retention status report template, embargo cron entry.</w:t>
+        <w:t xml:space="preserve"> </w:t>
+      </w:r>
+      <w:r>
+        <w:t xml:space="preserve">v1.3.0; configured</w:t>
+      </w:r>
+      <w:r>
+        <w:t xml:space="preserve"> </w:t>
+      </w:r>
+      <w:r>
+        <w:rPr>
+          <w:rStyle w:val="VerbatimChar"/>
+        </w:rPr>
+        <w:t xml:space="preserve">ahgNARSSAPlugin</w:t>
+      </w:r>
+      <w:r>
+        <w:t xml:space="preserve"> </w:t>
+      </w:r>
+      <w:r>
+        <w:t xml:space="preserve">v0.1.0; GCIS retention schedule loaded with disposal_action mappings; disposal-workflow walkthrough; NARS Act compliance mapping document;</w:t>
+      </w:r>
+      <w:r>
+        <w:t xml:space="preserve"> </w:t>
+      </w:r>
+      <w:r>
+        <w:rPr>
+          <w:bCs/>
+          <w:b/>
+        </w:rPr>
+        <w:t xml:space="preserve">5 pre-built GCIS compliance dashboards</w:t>
+      </w:r>
+      <w:r>
+        <w:t xml:space="preserve"> </w:t>
+      </w:r>
+      <w:r>
+        <w:t xml:space="preserve">in</w:t>
+      </w:r>
+      <w:r>
+        <w:t xml:space="preserve"> </w:t>
+      </w:r>
+      <w:r>
+        <w:rPr>
+          <w:rStyle w:val="VerbatimChar"/>
+        </w:rPr>
+        <w:t xml:space="preserve">ahgReportBuilderPlugin</w:t>
+      </w:r>
+      <w:r>
+        <w:t xml:space="preserve"> </w:t>
+      </w:r>
+      <w:r>
+        <w:t xml:space="preserve">(Audit Summary, Access Logs &amp; User Activity, Metadata Integrity, Retention Status &amp; Lifecycle, Consolidated Quarterly Dashboard); embargo cron entry.</w:t>
+      </w:r>
+    </w:p>
+    <w:p>
+      <w:pPr>
+        <w:pStyle w:val="BodyText"/>
+      </w:pPr>
+      <w:r>
+        <w:rPr>
+          <w:bCs/>
+          <w:b/>
+        </w:rPr>
+        <w:t xml:space="preserve">Built and shipped May 2026:</w:t>
+      </w:r>
+      <w:r>
+        <w:t xml:space="preserve"> </w:t>
+      </w:r>
+      <w:r>
+        <w:t xml:space="preserve">the underlying data model + workflow + audit dual-write are already live on PSIS. Phase 4 work is GCIS-specific</w:t>
+      </w:r>
+      <w:r>
+        <w:t xml:space="preserve"> </w:t>
+      </w:r>
+      <w:r>
+        <w:rPr>
+          <w:iCs/>
+          <w:i/>
+        </w:rPr>
+        <w:t xml:space="preserve">configuration</w:t>
+      </w:r>
+      <w:r>
+        <w:t xml:space="preserve"> </w:t>
+      </w:r>
+      <w:r>
+        <w:t xml:space="preserve">and integration testing, not new development.</w:t>
       </w:r>
     </w:p>
     <w:tbl>

</xml_diff>